<commit_message>
added pdf file converter and storage is now properly using firebase storage
</commit_message>
<xml_diff>
--- a/public/doc-templates/KP/permohonan-kp.docx
+++ b/public/doc-templates/KP/permohonan-kp.docx
@@ -1,6 +1,6 @@
 
 <file path=word/document.xml><?xml version="1.0" encoding="utf-8"?>
-<w:document xmlns:wpc="http://schemas.microsoft.com/office/word/2010/wordprocessingCanvas" xmlns:cx="http://schemas.microsoft.com/office/drawing/2014/chartex" xmlns:cx1="http://schemas.microsoft.com/office/drawing/2015/9/8/chartex" xmlns:cx2="http://schemas.microsoft.com/office/drawing/2015/10/21/chartex" xmlns:cx3="http://schemas.microsoft.com/office/drawing/2016/5/9/chartex" xmlns:cx4="http://schemas.microsoft.com/office/drawing/2016/5/10/chartex" xmlns:cx5="http://schemas.microsoft.com/office/drawing/2016/5/11/chartex" xmlns:cx6="http://schemas.microsoft.com/office/drawing/2016/5/12/chartex" xmlns:cx7="http://schemas.microsoft.com/office/drawing/2016/5/13/chartex" xmlns:cx8="http://schemas.microsoft.com/office/drawing/2016/5/14/chartex" xmlns:mc="http://schemas.openxmlformats.org/markup-compatibility/2006" xmlns:aink="http://schemas.microsoft.com/office/drawing/2016/ink" xmlns:am3d="http://schemas.microsoft.com/office/drawing/2017/model3d" xmlns:o="urn:schemas-microsoft-com:office:office" xmlns:oel="http://schemas.microsoft.com/office/2019/extlst" xmlns:r="http://schemas.openxmlformats.org/officeDocument/2006/relationships" xmlns:m="http://schemas.openxmlformats.org/officeDocument/2006/math" xmlns:v="urn:schemas-microsoft-com:vml" xmlns:wp14="http://schemas.microsoft.com/office/word/2010/wordprocessingDrawing" xmlns:wp="http://schemas.openxmlformats.org/drawingml/2006/wordprocessingDrawing" xmlns:w10="urn:schemas-microsoft-com:office:word" xmlns:w="http://schemas.openxmlformats.org/wordprocessingml/2006/main" xmlns:w14="http://schemas.microsoft.com/office/word/2010/wordml" xmlns:w15="http://schemas.microsoft.com/office/word/2012/wordml" xmlns:w16cei="http://schemas.microsoft.com/office/word/2026/wordml/cei" xmlns:w16cex="http://schemas.microsoft.com/office/word/2018/wordml/cex" xmlns:w16cid="http://schemas.microsoft.com/office/word/2016/wordml/cid" xmlns:w16="http://schemas.microsoft.com/office/word/2018/wordml" xmlns:w16du="http://schemas.microsoft.com/office/word/2023/wordml/word16du" xmlns:w16sdtdh="http://schemas.microsoft.com/office/word/2020/wordml/sdtdatahash" xmlns:w16sdtfl="http://schemas.microsoft.com/office/word/2024/wordml/sdtformatlock" xmlns:w16se="http://schemas.microsoft.com/office/word/2015/wordml/symex" xmlns:wpg="http://schemas.microsoft.com/office/word/2010/wordprocessingGroup" xmlns:wpi="http://schemas.microsoft.com/office/word/2010/wordprocessingInk" xmlns:wne="http://schemas.microsoft.com/office/word/2006/wordml" xmlns:wps="http://schemas.microsoft.com/office/word/2010/wordprocessingShape" mc:Ignorable="w14 w15 w16se w16cid w16 w16cex w16sdtdh w16sdtfl w16du wp14">
+<w:document xmlns:wpc="http://schemas.microsoft.com/office/word/2010/wordprocessingCanvas" xmlns:cx="http://schemas.microsoft.com/office/drawing/2014/chartex" xmlns:cx1="http://schemas.microsoft.com/office/drawing/2015/9/8/chartex" xmlns:cx2="http://schemas.microsoft.com/office/drawing/2015/10/21/chartex" xmlns:cx3="http://schemas.microsoft.com/office/drawing/2016/5/9/chartex" xmlns:cx4="http://schemas.microsoft.com/office/drawing/2016/5/10/chartex" xmlns:cx5="http://schemas.microsoft.com/office/drawing/2016/5/11/chartex" xmlns:cx6="http://schemas.microsoft.com/office/drawing/2016/5/12/chartex" xmlns:cx7="http://schemas.microsoft.com/office/drawing/2016/5/13/chartex" xmlns:cx8="http://schemas.microsoft.com/office/drawing/2016/5/14/chartex" xmlns:mc="http://schemas.openxmlformats.org/markup-compatibility/2006" xmlns:aink="http://schemas.microsoft.com/office/drawing/2016/ink" xmlns:am3d="http://schemas.microsoft.com/office/drawing/2017/model3d" xmlns:o="urn:schemas-microsoft-com:office:office" xmlns:oel="http://schemas.microsoft.com/office/2019/extlst" xmlns:r="http://schemas.openxmlformats.org/officeDocument/2006/relationships" xmlns:m="http://schemas.openxmlformats.org/officeDocument/2006/math" xmlns:v="urn:schemas-microsoft-com:vml" xmlns:wp14="http://schemas.microsoft.com/office/word/2010/wordprocessingDrawing" xmlns:wp="http://schemas.openxmlformats.org/drawingml/2006/wordprocessingDrawing" xmlns:w10="urn:schemas-microsoft-com:office:word" xmlns:w="http://schemas.openxmlformats.org/wordprocessingml/2006/main" xmlns:w14="http://schemas.microsoft.com/office/word/2010/wordml" xmlns:w15="http://schemas.microsoft.com/office/word/2012/wordml" xmlns:w16cex="http://schemas.microsoft.com/office/word/2018/wordml/cex" xmlns:w16cid="http://schemas.microsoft.com/office/word/2016/wordml/cid" xmlns:w16="http://schemas.microsoft.com/office/word/2018/wordml" xmlns:w16du="http://schemas.microsoft.com/office/word/2023/wordml/word16du" xmlns:w16sdtdh="http://schemas.microsoft.com/office/word/2020/wordml/sdtdatahash" xmlns:w16sdtfl="http://schemas.microsoft.com/office/word/2024/wordml/sdtformatlock" xmlns:w16se="http://schemas.microsoft.com/office/word/2015/wordml/symex" xmlns:wpg="http://schemas.microsoft.com/office/word/2010/wordprocessingGroup" xmlns:wpi="http://schemas.microsoft.com/office/word/2010/wordprocessingInk" xmlns:wne="http://schemas.microsoft.com/office/word/2006/wordml" xmlns:wps="http://schemas.microsoft.com/office/word/2010/wordprocessingShape" mc:Ignorable="w14 w15 w16se w16cid w16 w16cex w16sdtdh w16sdtfl w16du wp14">
   <w:body>
     <w:p>
       <w:pPr>
@@ -812,56 +812,6 @@
               </w:rPr>
               <w:t>Alamat/No, Telp/HP</w:t>
             </w:r>
-            <w:r>
-              <w:rPr>
-                <w:rFonts w:ascii="Times New Roman" w:hAnsi="Times New Roman" w:cs="Times New Roman"/>
-                <w:sz w:val="24"/>
-                <w:szCs w:val="24"/>
-              </w:rPr>
-              <w:t xml:space="preserve">   </w:t>
-            </w:r>
-            <w:r>
-              <w:rPr>
-                <w:rFonts w:ascii="Times New Roman" w:hAnsi="Times New Roman" w:cs="Times New Roman"/>
-                <w:sz w:val="24"/>
-                <w:szCs w:val="24"/>
-              </w:rPr>
-              <w:t xml:space="preserve">  </w:t>
-            </w:r>
-            <w:r>
-              <w:rPr>
-                <w:rFonts w:ascii="Times New Roman" w:hAnsi="Times New Roman" w:cs="Times New Roman"/>
-                <w:sz w:val="24"/>
-                <w:szCs w:val="24"/>
-              </w:rPr>
-              <w:t xml:space="preserve"> </w:t>
-            </w:r>
-            <w:proofErr w:type="gramStart"/>
-            <w:r>
-              <w:rPr>
-                <w:rFonts w:ascii="Times New Roman" w:hAnsi="Times New Roman" w:cs="Times New Roman"/>
-                <w:sz w:val="24"/>
-                <w:szCs w:val="24"/>
-              </w:rPr>
-              <w:t xml:space="preserve"> </w:t>
-            </w:r>
-            <w:r>
-              <w:rPr>
-                <w:rFonts w:ascii="Times New Roman" w:hAnsi="Times New Roman" w:cs="Times New Roman"/>
-                <w:sz w:val="24"/>
-                <w:szCs w:val="24"/>
-              </w:rPr>
-              <w:t xml:space="preserve"> </w:t>
-            </w:r>
-            <w:r>
-              <w:rPr>
-                <w:rFonts w:ascii="Times New Roman" w:hAnsi="Times New Roman" w:cs="Times New Roman"/>
-                <w:sz w:val="24"/>
-                <w:szCs w:val="24"/>
-              </w:rPr>
-              <w:t>:</w:t>
-            </w:r>
-            <w:proofErr w:type="gramEnd"/>
           </w:p>
         </w:tc>
         <w:tc>
@@ -959,50 +909,8 @@
                 <w:sz w:val="24"/>
                 <w:szCs w:val="24"/>
               </w:rPr>
-              <w:t xml:space="preserve"> KP                     </w:t>
-            </w:r>
-            <w:r>
-              <w:rPr>
-                <w:rFonts w:ascii="Times New Roman" w:hAnsi="Times New Roman" w:cs="Times New Roman"/>
-                <w:sz w:val="24"/>
-                <w:szCs w:val="24"/>
-              </w:rPr>
-              <w:t xml:space="preserve"> </w:t>
-            </w:r>
-            <w:r>
-              <w:rPr>
-                <w:rFonts w:ascii="Times New Roman" w:hAnsi="Times New Roman" w:cs="Times New Roman"/>
-                <w:sz w:val="24"/>
-                <w:szCs w:val="24"/>
-              </w:rPr>
-              <w:t xml:space="preserve"> </w:t>
-            </w:r>
-            <w:r>
-              <w:rPr>
-                <w:rFonts w:ascii="Times New Roman" w:hAnsi="Times New Roman" w:cs="Times New Roman"/>
-                <w:sz w:val="24"/>
-                <w:szCs w:val="24"/>
-              </w:rPr>
-              <w:t xml:space="preserve"> </w:t>
-            </w:r>
-            <w:proofErr w:type="gramStart"/>
-            <w:r>
-              <w:rPr>
-                <w:rFonts w:ascii="Times New Roman" w:hAnsi="Times New Roman" w:cs="Times New Roman"/>
-                <w:sz w:val="24"/>
-                <w:szCs w:val="24"/>
-              </w:rPr>
-              <w:t xml:space="preserve">  </w:t>
-            </w:r>
-            <w:r>
-              <w:rPr>
-                <w:rFonts w:ascii="Times New Roman" w:hAnsi="Times New Roman" w:cs="Times New Roman"/>
-                <w:sz w:val="24"/>
-                <w:szCs w:val="24"/>
-              </w:rPr>
-              <w:t>:</w:t>
-            </w:r>
-            <w:proofErr w:type="gramEnd"/>
+              <w:t xml:space="preserve"> KP</w:t>
+            </w:r>
             <w:r>
               <w:rPr>
                 <w:rFonts w:ascii="Times New Roman" w:hAnsi="Times New Roman" w:cs="Times New Roman"/>
@@ -1182,6 +1090,7 @@
         </w:rPr>
         <w:t xml:space="preserve"> </w:t>
       </w:r>
+      <w:proofErr w:type="spellStart"/>
       <w:r>
         <w:rPr>
           <w:rFonts w:ascii="Times New Roman" w:hAnsi="Times New Roman" w:cs="Times New Roman"/>
@@ -1196,7 +1105,16 @@
           <w:sz w:val="24"/>
           <w:szCs w:val="24"/>
         </w:rPr>
-        <w:t xml:space="preserve">raktik di </w:t>
+        <w:t>raktik</w:t>
+      </w:r>
+      <w:proofErr w:type="spellEnd"/>
+      <w:r>
+        <w:rPr>
+          <w:rFonts w:ascii="Times New Roman" w:hAnsi="Times New Roman" w:cs="Times New Roman"/>
+          <w:sz w:val="24"/>
+          <w:szCs w:val="24"/>
+        </w:rPr>
+        <w:t xml:space="preserve"> di </w:t>
       </w:r>
     </w:p>
     <w:p>
@@ -2327,7 +2245,7 @@
 </file>
 
 <file path=word/endnotes.xml><?xml version="1.0" encoding="utf-8"?>
-<w:endnotes xmlns:wpc="http://schemas.microsoft.com/office/word/2010/wordprocessingCanvas" xmlns:cx="http://schemas.microsoft.com/office/drawing/2014/chartex" xmlns:cx1="http://schemas.microsoft.com/office/drawing/2015/9/8/chartex" xmlns:cx2="http://schemas.microsoft.com/office/drawing/2015/10/21/chartex" xmlns:cx3="http://schemas.microsoft.com/office/drawing/2016/5/9/chartex" xmlns:cx4="http://schemas.microsoft.com/office/drawing/2016/5/10/chartex" xmlns:cx5="http://schemas.microsoft.com/office/drawing/2016/5/11/chartex" xmlns:cx6="http://schemas.microsoft.com/office/drawing/2016/5/12/chartex" xmlns:cx7="http://schemas.microsoft.com/office/drawing/2016/5/13/chartex" xmlns:cx8="http://schemas.microsoft.com/office/drawing/2016/5/14/chartex" xmlns:mc="http://schemas.openxmlformats.org/markup-compatibility/2006" xmlns:aink="http://schemas.microsoft.com/office/drawing/2016/ink" xmlns:am3d="http://schemas.microsoft.com/office/drawing/2017/model3d" xmlns:o="urn:schemas-microsoft-com:office:office" xmlns:oel="http://schemas.microsoft.com/office/2019/extlst" xmlns:r="http://schemas.openxmlformats.org/officeDocument/2006/relationships" xmlns:m="http://schemas.openxmlformats.org/officeDocument/2006/math" xmlns:v="urn:schemas-microsoft-com:vml" xmlns:wp14="http://schemas.microsoft.com/office/word/2010/wordprocessingDrawing" xmlns:wp="http://schemas.openxmlformats.org/drawingml/2006/wordprocessingDrawing" xmlns:w10="urn:schemas-microsoft-com:office:word" xmlns:w="http://schemas.openxmlformats.org/wordprocessingml/2006/main" xmlns:w14="http://schemas.microsoft.com/office/word/2010/wordml" xmlns:w15="http://schemas.microsoft.com/office/word/2012/wordml" xmlns:w16cei="http://schemas.microsoft.com/office/word/2026/wordml/cei" xmlns:w16cex="http://schemas.microsoft.com/office/word/2018/wordml/cex" xmlns:w16cid="http://schemas.microsoft.com/office/word/2016/wordml/cid" xmlns:w16="http://schemas.microsoft.com/office/word/2018/wordml" xmlns:w16du="http://schemas.microsoft.com/office/word/2023/wordml/word16du" xmlns:w16sdtdh="http://schemas.microsoft.com/office/word/2020/wordml/sdtdatahash" xmlns:w16sdtfl="http://schemas.microsoft.com/office/word/2024/wordml/sdtformatlock" xmlns:w16se="http://schemas.microsoft.com/office/word/2015/wordml/symex" xmlns:wpg="http://schemas.microsoft.com/office/word/2010/wordprocessingGroup" xmlns:wpi="http://schemas.microsoft.com/office/word/2010/wordprocessingInk" xmlns:wne="http://schemas.microsoft.com/office/word/2006/wordml" xmlns:wps="http://schemas.microsoft.com/office/word/2010/wordprocessingShape" mc:Ignorable="w14 w15 w16se w16cid w16 w16cex w16sdtdh w16sdtfl w16du wp14">
+<w:endnotes xmlns:wpc="http://schemas.microsoft.com/office/word/2010/wordprocessingCanvas" xmlns:cx="http://schemas.microsoft.com/office/drawing/2014/chartex" xmlns:cx1="http://schemas.microsoft.com/office/drawing/2015/9/8/chartex" xmlns:cx2="http://schemas.microsoft.com/office/drawing/2015/10/21/chartex" xmlns:cx3="http://schemas.microsoft.com/office/drawing/2016/5/9/chartex" xmlns:cx4="http://schemas.microsoft.com/office/drawing/2016/5/10/chartex" xmlns:cx5="http://schemas.microsoft.com/office/drawing/2016/5/11/chartex" xmlns:cx6="http://schemas.microsoft.com/office/drawing/2016/5/12/chartex" xmlns:cx7="http://schemas.microsoft.com/office/drawing/2016/5/13/chartex" xmlns:cx8="http://schemas.microsoft.com/office/drawing/2016/5/14/chartex" xmlns:mc="http://schemas.openxmlformats.org/markup-compatibility/2006" xmlns:aink="http://schemas.microsoft.com/office/drawing/2016/ink" xmlns:am3d="http://schemas.microsoft.com/office/drawing/2017/model3d" xmlns:o="urn:schemas-microsoft-com:office:office" xmlns:oel="http://schemas.microsoft.com/office/2019/extlst" xmlns:r="http://schemas.openxmlformats.org/officeDocument/2006/relationships" xmlns:m="http://schemas.openxmlformats.org/officeDocument/2006/math" xmlns:v="urn:schemas-microsoft-com:vml" xmlns:wp14="http://schemas.microsoft.com/office/word/2010/wordprocessingDrawing" xmlns:wp="http://schemas.openxmlformats.org/drawingml/2006/wordprocessingDrawing" xmlns:w10="urn:schemas-microsoft-com:office:word" xmlns:w="http://schemas.openxmlformats.org/wordprocessingml/2006/main" xmlns:w14="http://schemas.microsoft.com/office/word/2010/wordml" xmlns:w15="http://schemas.microsoft.com/office/word/2012/wordml" xmlns:w16cex="http://schemas.microsoft.com/office/word/2018/wordml/cex" xmlns:w16cid="http://schemas.microsoft.com/office/word/2016/wordml/cid" xmlns:w16="http://schemas.microsoft.com/office/word/2018/wordml" xmlns:w16du="http://schemas.microsoft.com/office/word/2023/wordml/word16du" xmlns:w16sdtdh="http://schemas.microsoft.com/office/word/2020/wordml/sdtdatahash" xmlns:w16sdtfl="http://schemas.microsoft.com/office/word/2024/wordml/sdtformatlock" xmlns:w16se="http://schemas.microsoft.com/office/word/2015/wordml/symex" xmlns:wpg="http://schemas.microsoft.com/office/word/2010/wordprocessingGroup" xmlns:wpi="http://schemas.microsoft.com/office/word/2010/wordprocessingInk" xmlns:wne="http://schemas.microsoft.com/office/word/2006/wordml" xmlns:wps="http://schemas.microsoft.com/office/word/2010/wordprocessingShape" mc:Ignorable="w14 w15 w16se w16cid w16 w16cex w16sdtdh w16sdtfl w16du wp14">
   <w:endnote w:type="separator" w:id="-1">
     <w:p>
       <w:pPr>
@@ -2352,7 +2270,7 @@
 </file>
 
 <file path=word/footer1.xml><?xml version="1.0" encoding="utf-8"?>
-<w:ftr xmlns:wpc="http://schemas.microsoft.com/office/word/2010/wordprocessingCanvas" xmlns:cx="http://schemas.microsoft.com/office/drawing/2014/chartex" xmlns:cx1="http://schemas.microsoft.com/office/drawing/2015/9/8/chartex" xmlns:cx2="http://schemas.microsoft.com/office/drawing/2015/10/21/chartex" xmlns:cx3="http://schemas.microsoft.com/office/drawing/2016/5/9/chartex" xmlns:cx4="http://schemas.microsoft.com/office/drawing/2016/5/10/chartex" xmlns:cx5="http://schemas.microsoft.com/office/drawing/2016/5/11/chartex" xmlns:cx6="http://schemas.microsoft.com/office/drawing/2016/5/12/chartex" xmlns:cx7="http://schemas.microsoft.com/office/drawing/2016/5/13/chartex" xmlns:cx8="http://schemas.microsoft.com/office/drawing/2016/5/14/chartex" xmlns:mc="http://schemas.openxmlformats.org/markup-compatibility/2006" xmlns:aink="http://schemas.microsoft.com/office/drawing/2016/ink" xmlns:am3d="http://schemas.microsoft.com/office/drawing/2017/model3d" xmlns:o="urn:schemas-microsoft-com:office:office" xmlns:oel="http://schemas.microsoft.com/office/2019/extlst" xmlns:r="http://schemas.openxmlformats.org/officeDocument/2006/relationships" xmlns:m="http://schemas.openxmlformats.org/officeDocument/2006/math" xmlns:v="urn:schemas-microsoft-com:vml" xmlns:wp14="http://schemas.microsoft.com/office/word/2010/wordprocessingDrawing" xmlns:wp="http://schemas.openxmlformats.org/drawingml/2006/wordprocessingDrawing" xmlns:w10="urn:schemas-microsoft-com:office:word" xmlns:w="http://schemas.openxmlformats.org/wordprocessingml/2006/main" xmlns:w14="http://schemas.microsoft.com/office/word/2010/wordml" xmlns:w15="http://schemas.microsoft.com/office/word/2012/wordml" xmlns:w16cei="http://schemas.microsoft.com/office/word/2026/wordml/cei" xmlns:w16cex="http://schemas.microsoft.com/office/word/2018/wordml/cex" xmlns:w16cid="http://schemas.microsoft.com/office/word/2016/wordml/cid" xmlns:w16="http://schemas.microsoft.com/office/word/2018/wordml" xmlns:w16du="http://schemas.microsoft.com/office/word/2023/wordml/word16du" xmlns:w16sdtdh="http://schemas.microsoft.com/office/word/2020/wordml/sdtdatahash" xmlns:w16sdtfl="http://schemas.microsoft.com/office/word/2024/wordml/sdtformatlock" xmlns:w16se="http://schemas.microsoft.com/office/word/2015/wordml/symex" xmlns:wpg="http://schemas.microsoft.com/office/word/2010/wordprocessingGroup" xmlns:wpi="http://schemas.microsoft.com/office/word/2010/wordprocessingInk" xmlns:wne="http://schemas.microsoft.com/office/word/2006/wordml" xmlns:wps="http://schemas.microsoft.com/office/word/2010/wordprocessingShape" mc:Ignorable="w14 w15 w16se w16cid w16 w16cex w16sdtdh w16sdtfl w16du wp14">
+<w:ftr xmlns:wpc="http://schemas.microsoft.com/office/word/2010/wordprocessingCanvas" xmlns:cx="http://schemas.microsoft.com/office/drawing/2014/chartex" xmlns:cx1="http://schemas.microsoft.com/office/drawing/2015/9/8/chartex" xmlns:cx2="http://schemas.microsoft.com/office/drawing/2015/10/21/chartex" xmlns:cx3="http://schemas.microsoft.com/office/drawing/2016/5/9/chartex" xmlns:cx4="http://schemas.microsoft.com/office/drawing/2016/5/10/chartex" xmlns:cx5="http://schemas.microsoft.com/office/drawing/2016/5/11/chartex" xmlns:cx6="http://schemas.microsoft.com/office/drawing/2016/5/12/chartex" xmlns:cx7="http://schemas.microsoft.com/office/drawing/2016/5/13/chartex" xmlns:cx8="http://schemas.microsoft.com/office/drawing/2016/5/14/chartex" xmlns:mc="http://schemas.openxmlformats.org/markup-compatibility/2006" xmlns:aink="http://schemas.microsoft.com/office/drawing/2016/ink" xmlns:am3d="http://schemas.microsoft.com/office/drawing/2017/model3d" xmlns:o="urn:schemas-microsoft-com:office:office" xmlns:oel="http://schemas.microsoft.com/office/2019/extlst" xmlns:r="http://schemas.openxmlformats.org/officeDocument/2006/relationships" xmlns:m="http://schemas.openxmlformats.org/officeDocument/2006/math" xmlns:v="urn:schemas-microsoft-com:vml" xmlns:wp14="http://schemas.microsoft.com/office/word/2010/wordprocessingDrawing" xmlns:wp="http://schemas.openxmlformats.org/drawingml/2006/wordprocessingDrawing" xmlns:w10="urn:schemas-microsoft-com:office:word" xmlns:w="http://schemas.openxmlformats.org/wordprocessingml/2006/main" xmlns:w14="http://schemas.microsoft.com/office/word/2010/wordml" xmlns:w15="http://schemas.microsoft.com/office/word/2012/wordml" xmlns:w16cex="http://schemas.microsoft.com/office/word/2018/wordml/cex" xmlns:w16cid="http://schemas.microsoft.com/office/word/2016/wordml/cid" xmlns:w16="http://schemas.microsoft.com/office/word/2018/wordml" xmlns:w16du="http://schemas.microsoft.com/office/word/2023/wordml/word16du" xmlns:w16sdtdh="http://schemas.microsoft.com/office/word/2020/wordml/sdtdatahash" xmlns:w16sdtfl="http://schemas.microsoft.com/office/word/2024/wordml/sdtformatlock" xmlns:w16se="http://schemas.microsoft.com/office/word/2015/wordml/symex" xmlns:wpg="http://schemas.microsoft.com/office/word/2010/wordprocessingGroup" xmlns:wpi="http://schemas.microsoft.com/office/word/2010/wordprocessingInk" xmlns:wne="http://schemas.microsoft.com/office/word/2006/wordml" xmlns:wps="http://schemas.microsoft.com/office/word/2010/wordprocessingShape" mc:Ignorable="w14 w15 w16se w16cid w16 w16cex w16sdtdh w16sdtfl w16du wp14">
   <w:bookmarkStart w:id="3" w:name="_Hlk32345472"/>
   <w:bookmarkStart w:id="4" w:name="_Hlk32345473"/>
   <w:p>
@@ -2435,7 +2353,7 @@
             </wp:anchor>
           </w:drawing>
         </mc:Choice>
-        <mc:Fallback>
+        <mc:Fallback xmlns:w16cei="http://schemas.microsoft.com/office/word/2026/wordml/cei">
           <w:pict>
             <v:shapetype w14:anchorId="0D96438A" id="_x0000_t32" coordsize="21600,21600" o:spt="32" o:oned="t" path="m,l21600,21600e" filled="f">
               <v:path arrowok="t" fillok="f" o:connecttype="none"/>
@@ -2531,7 +2449,7 @@
 </file>
 
 <file path=word/footnotes.xml><?xml version="1.0" encoding="utf-8"?>
-<w:footnotes xmlns:wpc="http://schemas.microsoft.com/office/word/2010/wordprocessingCanvas" xmlns:cx="http://schemas.microsoft.com/office/drawing/2014/chartex" xmlns:cx1="http://schemas.microsoft.com/office/drawing/2015/9/8/chartex" xmlns:cx2="http://schemas.microsoft.com/office/drawing/2015/10/21/chartex" xmlns:cx3="http://schemas.microsoft.com/office/drawing/2016/5/9/chartex" xmlns:cx4="http://schemas.microsoft.com/office/drawing/2016/5/10/chartex" xmlns:cx5="http://schemas.microsoft.com/office/drawing/2016/5/11/chartex" xmlns:cx6="http://schemas.microsoft.com/office/drawing/2016/5/12/chartex" xmlns:cx7="http://schemas.microsoft.com/office/drawing/2016/5/13/chartex" xmlns:cx8="http://schemas.microsoft.com/office/drawing/2016/5/14/chartex" xmlns:mc="http://schemas.openxmlformats.org/markup-compatibility/2006" xmlns:aink="http://schemas.microsoft.com/office/drawing/2016/ink" xmlns:am3d="http://schemas.microsoft.com/office/drawing/2017/model3d" xmlns:o="urn:schemas-microsoft-com:office:office" xmlns:oel="http://schemas.microsoft.com/office/2019/extlst" xmlns:r="http://schemas.openxmlformats.org/officeDocument/2006/relationships" xmlns:m="http://schemas.openxmlformats.org/officeDocument/2006/math" xmlns:v="urn:schemas-microsoft-com:vml" xmlns:wp14="http://schemas.microsoft.com/office/word/2010/wordprocessingDrawing" xmlns:wp="http://schemas.openxmlformats.org/drawingml/2006/wordprocessingDrawing" xmlns:w10="urn:schemas-microsoft-com:office:word" xmlns:w="http://schemas.openxmlformats.org/wordprocessingml/2006/main" xmlns:w14="http://schemas.microsoft.com/office/word/2010/wordml" xmlns:w15="http://schemas.microsoft.com/office/word/2012/wordml" xmlns:w16cei="http://schemas.microsoft.com/office/word/2026/wordml/cei" xmlns:w16cex="http://schemas.microsoft.com/office/word/2018/wordml/cex" xmlns:w16cid="http://schemas.microsoft.com/office/word/2016/wordml/cid" xmlns:w16="http://schemas.microsoft.com/office/word/2018/wordml" xmlns:w16du="http://schemas.microsoft.com/office/word/2023/wordml/word16du" xmlns:w16sdtdh="http://schemas.microsoft.com/office/word/2020/wordml/sdtdatahash" xmlns:w16sdtfl="http://schemas.microsoft.com/office/word/2024/wordml/sdtformatlock" xmlns:w16se="http://schemas.microsoft.com/office/word/2015/wordml/symex" xmlns:wpg="http://schemas.microsoft.com/office/word/2010/wordprocessingGroup" xmlns:wpi="http://schemas.microsoft.com/office/word/2010/wordprocessingInk" xmlns:wne="http://schemas.microsoft.com/office/word/2006/wordml" xmlns:wps="http://schemas.microsoft.com/office/word/2010/wordprocessingShape" mc:Ignorable="w14 w15 w16se w16cid w16 w16cex w16sdtdh w16sdtfl w16du wp14">
+<w:footnotes xmlns:wpc="http://schemas.microsoft.com/office/word/2010/wordprocessingCanvas" xmlns:cx="http://schemas.microsoft.com/office/drawing/2014/chartex" xmlns:cx1="http://schemas.microsoft.com/office/drawing/2015/9/8/chartex" xmlns:cx2="http://schemas.microsoft.com/office/drawing/2015/10/21/chartex" xmlns:cx3="http://schemas.microsoft.com/office/drawing/2016/5/9/chartex" xmlns:cx4="http://schemas.microsoft.com/office/drawing/2016/5/10/chartex" xmlns:cx5="http://schemas.microsoft.com/office/drawing/2016/5/11/chartex" xmlns:cx6="http://schemas.microsoft.com/office/drawing/2016/5/12/chartex" xmlns:cx7="http://schemas.microsoft.com/office/drawing/2016/5/13/chartex" xmlns:cx8="http://schemas.microsoft.com/office/drawing/2016/5/14/chartex" xmlns:mc="http://schemas.openxmlformats.org/markup-compatibility/2006" xmlns:aink="http://schemas.microsoft.com/office/drawing/2016/ink" xmlns:am3d="http://schemas.microsoft.com/office/drawing/2017/model3d" xmlns:o="urn:schemas-microsoft-com:office:office" xmlns:oel="http://schemas.microsoft.com/office/2019/extlst" xmlns:r="http://schemas.openxmlformats.org/officeDocument/2006/relationships" xmlns:m="http://schemas.openxmlformats.org/officeDocument/2006/math" xmlns:v="urn:schemas-microsoft-com:vml" xmlns:wp14="http://schemas.microsoft.com/office/word/2010/wordprocessingDrawing" xmlns:wp="http://schemas.openxmlformats.org/drawingml/2006/wordprocessingDrawing" xmlns:w10="urn:schemas-microsoft-com:office:word" xmlns:w="http://schemas.openxmlformats.org/wordprocessingml/2006/main" xmlns:w14="http://schemas.microsoft.com/office/word/2010/wordml" xmlns:w15="http://schemas.microsoft.com/office/word/2012/wordml" xmlns:w16cex="http://schemas.microsoft.com/office/word/2018/wordml/cex" xmlns:w16cid="http://schemas.microsoft.com/office/word/2016/wordml/cid" xmlns:w16="http://schemas.microsoft.com/office/word/2018/wordml" xmlns:w16du="http://schemas.microsoft.com/office/word/2023/wordml/word16du" xmlns:w16sdtdh="http://schemas.microsoft.com/office/word/2020/wordml/sdtdatahash" xmlns:w16sdtfl="http://schemas.microsoft.com/office/word/2024/wordml/sdtformatlock" xmlns:w16se="http://schemas.microsoft.com/office/word/2015/wordml/symex" xmlns:wpg="http://schemas.microsoft.com/office/word/2010/wordprocessingGroup" xmlns:wpi="http://schemas.microsoft.com/office/word/2010/wordprocessingInk" xmlns:wne="http://schemas.microsoft.com/office/word/2006/wordml" xmlns:wps="http://schemas.microsoft.com/office/word/2010/wordprocessingShape" mc:Ignorable="w14 w15 w16se w16cid w16 w16cex w16sdtdh w16sdtfl w16du wp14">
   <w:footnote w:type="separator" w:id="-1">
     <w:p>
       <w:pPr>
@@ -2556,14 +2474,14 @@
 </file>
 
 <file path=word/header1.xml><?xml version="1.0" encoding="utf-8"?>
-<w:hdr xmlns:wpc="http://schemas.microsoft.com/office/word/2010/wordprocessingCanvas" xmlns:cx="http://schemas.microsoft.com/office/drawing/2014/chartex" xmlns:cx1="http://schemas.microsoft.com/office/drawing/2015/9/8/chartex" xmlns:cx2="http://schemas.microsoft.com/office/drawing/2015/10/21/chartex" xmlns:cx3="http://schemas.microsoft.com/office/drawing/2016/5/9/chartex" xmlns:cx4="http://schemas.microsoft.com/office/drawing/2016/5/10/chartex" xmlns:cx5="http://schemas.microsoft.com/office/drawing/2016/5/11/chartex" xmlns:cx6="http://schemas.microsoft.com/office/drawing/2016/5/12/chartex" xmlns:cx7="http://schemas.microsoft.com/office/drawing/2016/5/13/chartex" xmlns:cx8="http://schemas.microsoft.com/office/drawing/2016/5/14/chartex" xmlns:mc="http://schemas.openxmlformats.org/markup-compatibility/2006" xmlns:aink="http://schemas.microsoft.com/office/drawing/2016/ink" xmlns:am3d="http://schemas.microsoft.com/office/drawing/2017/model3d" xmlns:o="urn:schemas-microsoft-com:office:office" xmlns:oel="http://schemas.microsoft.com/office/2019/extlst" xmlns:r="http://schemas.openxmlformats.org/officeDocument/2006/relationships" xmlns:m="http://schemas.openxmlformats.org/officeDocument/2006/math" xmlns:v="urn:schemas-microsoft-com:vml" xmlns:wp14="http://schemas.microsoft.com/office/word/2010/wordprocessingDrawing" xmlns:wp="http://schemas.openxmlformats.org/drawingml/2006/wordprocessingDrawing" xmlns:w10="urn:schemas-microsoft-com:office:word" xmlns:w="http://schemas.openxmlformats.org/wordprocessingml/2006/main" xmlns:w14="http://schemas.microsoft.com/office/word/2010/wordml" xmlns:w15="http://schemas.microsoft.com/office/word/2012/wordml" xmlns:w16cei="http://schemas.microsoft.com/office/word/2026/wordml/cei" xmlns:w16cex="http://schemas.microsoft.com/office/word/2018/wordml/cex" xmlns:w16cid="http://schemas.microsoft.com/office/word/2016/wordml/cid" xmlns:w16="http://schemas.microsoft.com/office/word/2018/wordml" xmlns:w16du="http://schemas.microsoft.com/office/word/2023/wordml/word16du" xmlns:w16sdtdh="http://schemas.microsoft.com/office/word/2020/wordml/sdtdatahash" xmlns:w16sdtfl="http://schemas.microsoft.com/office/word/2024/wordml/sdtformatlock" xmlns:w16se="http://schemas.microsoft.com/office/word/2015/wordml/symex" xmlns:wpg="http://schemas.microsoft.com/office/word/2010/wordprocessingGroup" xmlns:wpi="http://schemas.microsoft.com/office/word/2010/wordprocessingInk" xmlns:wne="http://schemas.microsoft.com/office/word/2006/wordml" xmlns:wps="http://schemas.microsoft.com/office/word/2010/wordprocessingShape" mc:Ignorable="w14 w15 w16se w16cid w16 w16cex w16sdtdh w16sdtfl w16du wp14">
-  <w:bookmarkStart w:id="1" w:name="_Hlk184387129"/>
-  <w:bookmarkStart w:id="2" w:name="_Hlk184387130"/>
+<w:hdr xmlns:wpc="http://schemas.microsoft.com/office/word/2010/wordprocessingCanvas" xmlns:cx="http://schemas.microsoft.com/office/drawing/2014/chartex" xmlns:cx1="http://schemas.microsoft.com/office/drawing/2015/9/8/chartex" xmlns:cx2="http://schemas.microsoft.com/office/drawing/2015/10/21/chartex" xmlns:cx3="http://schemas.microsoft.com/office/drawing/2016/5/9/chartex" xmlns:cx4="http://schemas.microsoft.com/office/drawing/2016/5/10/chartex" xmlns:cx5="http://schemas.microsoft.com/office/drawing/2016/5/11/chartex" xmlns:cx6="http://schemas.microsoft.com/office/drawing/2016/5/12/chartex" xmlns:cx7="http://schemas.microsoft.com/office/drawing/2016/5/13/chartex" xmlns:cx8="http://schemas.microsoft.com/office/drawing/2016/5/14/chartex" xmlns:mc="http://schemas.openxmlformats.org/markup-compatibility/2006" xmlns:aink="http://schemas.microsoft.com/office/drawing/2016/ink" xmlns:am3d="http://schemas.microsoft.com/office/drawing/2017/model3d" xmlns:o="urn:schemas-microsoft-com:office:office" xmlns:oel="http://schemas.microsoft.com/office/2019/extlst" xmlns:r="http://schemas.openxmlformats.org/officeDocument/2006/relationships" xmlns:m="http://schemas.openxmlformats.org/officeDocument/2006/math" xmlns:v="urn:schemas-microsoft-com:vml" xmlns:wp14="http://schemas.microsoft.com/office/word/2010/wordprocessingDrawing" xmlns:wp="http://schemas.openxmlformats.org/drawingml/2006/wordprocessingDrawing" xmlns:w10="urn:schemas-microsoft-com:office:word" xmlns:w="http://schemas.openxmlformats.org/wordprocessingml/2006/main" xmlns:w14="http://schemas.microsoft.com/office/word/2010/wordml" xmlns:w15="http://schemas.microsoft.com/office/word/2012/wordml" xmlns:w16cex="http://schemas.microsoft.com/office/word/2018/wordml/cex" xmlns:w16cid="http://schemas.microsoft.com/office/word/2016/wordml/cid" xmlns:w16="http://schemas.microsoft.com/office/word/2018/wordml" xmlns:w16du="http://schemas.microsoft.com/office/word/2023/wordml/word16du" xmlns:w16sdtdh="http://schemas.microsoft.com/office/word/2020/wordml/sdtdatahash" xmlns:w16sdtfl="http://schemas.microsoft.com/office/word/2024/wordml/sdtformatlock" xmlns:w16se="http://schemas.microsoft.com/office/word/2015/wordml/symex" xmlns:wpg="http://schemas.microsoft.com/office/word/2010/wordprocessingGroup" xmlns:wpi="http://schemas.microsoft.com/office/word/2010/wordprocessingInk" xmlns:wne="http://schemas.microsoft.com/office/word/2006/wordml" xmlns:wps="http://schemas.microsoft.com/office/word/2010/wordprocessingShape" mc:Ignorable="w14 w15 w16se w16cid w16 w16cex w16sdtdh w16sdtfl w16du wp14">
   <w:p>
     <w:pPr>
       <w:pStyle w:val="Header"/>
       <w:spacing w:before="240" w:after="240"/>
     </w:pPr>
+    <w:bookmarkStart w:id="1" w:name="_Hlk184387129"/>
+    <w:bookmarkStart w:id="2" w:name="_Hlk184387130"/>
     <w:r>
       <w:rPr>
         <w:noProof/>
@@ -3400,7 +3318,7 @@
 </file>
 
 <file path=word/numbering.xml><?xml version="1.0" encoding="utf-8"?>
-<w:numbering xmlns:wpc="http://schemas.microsoft.com/office/word/2010/wordprocessingCanvas" xmlns:cx="http://schemas.microsoft.com/office/drawing/2014/chartex" xmlns:cx1="http://schemas.microsoft.com/office/drawing/2015/9/8/chartex" xmlns:cx2="http://schemas.microsoft.com/office/drawing/2015/10/21/chartex" xmlns:cx3="http://schemas.microsoft.com/office/drawing/2016/5/9/chartex" xmlns:cx4="http://schemas.microsoft.com/office/drawing/2016/5/10/chartex" xmlns:cx5="http://schemas.microsoft.com/office/drawing/2016/5/11/chartex" xmlns:cx6="http://schemas.microsoft.com/office/drawing/2016/5/12/chartex" xmlns:cx7="http://schemas.microsoft.com/office/drawing/2016/5/13/chartex" xmlns:cx8="http://schemas.microsoft.com/office/drawing/2016/5/14/chartex" xmlns:mc="http://schemas.openxmlformats.org/markup-compatibility/2006" xmlns:aink="http://schemas.microsoft.com/office/drawing/2016/ink" xmlns:am3d="http://schemas.microsoft.com/office/drawing/2017/model3d" xmlns:o="urn:schemas-microsoft-com:office:office" xmlns:oel="http://schemas.microsoft.com/office/2019/extlst" xmlns:r="http://schemas.openxmlformats.org/officeDocument/2006/relationships" xmlns:m="http://schemas.openxmlformats.org/officeDocument/2006/math" xmlns:v="urn:schemas-microsoft-com:vml" xmlns:wp14="http://schemas.microsoft.com/office/word/2010/wordprocessingDrawing" xmlns:wp="http://schemas.openxmlformats.org/drawingml/2006/wordprocessingDrawing" xmlns:w10="urn:schemas-microsoft-com:office:word" xmlns:w="http://schemas.openxmlformats.org/wordprocessingml/2006/main" xmlns:w14="http://schemas.microsoft.com/office/word/2010/wordml" xmlns:w15="http://schemas.microsoft.com/office/word/2012/wordml" xmlns:w16cei="http://schemas.microsoft.com/office/word/2026/wordml/cei" xmlns:w16cex="http://schemas.microsoft.com/office/word/2018/wordml/cex" xmlns:w16cid="http://schemas.microsoft.com/office/word/2016/wordml/cid" xmlns:w16="http://schemas.microsoft.com/office/word/2018/wordml" xmlns:w16du="http://schemas.microsoft.com/office/word/2023/wordml/word16du" xmlns:w16sdtdh="http://schemas.microsoft.com/office/word/2020/wordml/sdtdatahash" xmlns:w16sdtfl="http://schemas.microsoft.com/office/word/2024/wordml/sdtformatlock" xmlns:w16se="http://schemas.microsoft.com/office/word/2015/wordml/symex" xmlns:wpg="http://schemas.microsoft.com/office/word/2010/wordprocessingGroup" xmlns:wpi="http://schemas.microsoft.com/office/word/2010/wordprocessingInk" xmlns:wne="http://schemas.microsoft.com/office/word/2006/wordml" xmlns:wps="http://schemas.microsoft.com/office/word/2010/wordprocessingShape" mc:Ignorable="w14 w15 w16se w16cid w16 w16cex w16sdtdh w16sdtfl w16du wp14">
+<w:numbering xmlns:wpc="http://schemas.microsoft.com/office/word/2010/wordprocessingCanvas" xmlns:cx="http://schemas.microsoft.com/office/drawing/2014/chartex" xmlns:cx1="http://schemas.microsoft.com/office/drawing/2015/9/8/chartex" xmlns:cx2="http://schemas.microsoft.com/office/drawing/2015/10/21/chartex" xmlns:cx3="http://schemas.microsoft.com/office/drawing/2016/5/9/chartex" xmlns:cx4="http://schemas.microsoft.com/office/drawing/2016/5/10/chartex" xmlns:cx5="http://schemas.microsoft.com/office/drawing/2016/5/11/chartex" xmlns:cx6="http://schemas.microsoft.com/office/drawing/2016/5/12/chartex" xmlns:cx7="http://schemas.microsoft.com/office/drawing/2016/5/13/chartex" xmlns:cx8="http://schemas.microsoft.com/office/drawing/2016/5/14/chartex" xmlns:mc="http://schemas.openxmlformats.org/markup-compatibility/2006" xmlns:aink="http://schemas.microsoft.com/office/drawing/2016/ink" xmlns:am3d="http://schemas.microsoft.com/office/drawing/2017/model3d" xmlns:o="urn:schemas-microsoft-com:office:office" xmlns:oel="http://schemas.microsoft.com/office/2019/extlst" xmlns:r="http://schemas.openxmlformats.org/officeDocument/2006/relationships" xmlns:m="http://schemas.openxmlformats.org/officeDocument/2006/math" xmlns:v="urn:schemas-microsoft-com:vml" xmlns:wp14="http://schemas.microsoft.com/office/word/2010/wordprocessingDrawing" xmlns:wp="http://schemas.openxmlformats.org/drawingml/2006/wordprocessingDrawing" xmlns:w10="urn:schemas-microsoft-com:office:word" xmlns:w="http://schemas.openxmlformats.org/wordprocessingml/2006/main" xmlns:w14="http://schemas.microsoft.com/office/word/2010/wordml" xmlns:w15="http://schemas.microsoft.com/office/word/2012/wordml" xmlns:w16cex="http://schemas.microsoft.com/office/word/2018/wordml/cex" xmlns:w16cid="http://schemas.microsoft.com/office/word/2016/wordml/cid" xmlns:w16="http://schemas.microsoft.com/office/word/2018/wordml" xmlns:w16du="http://schemas.microsoft.com/office/word/2023/wordml/word16du" xmlns:w16sdtdh="http://schemas.microsoft.com/office/word/2020/wordml/sdtdatahash" xmlns:w16sdtfl="http://schemas.microsoft.com/office/word/2024/wordml/sdtformatlock" xmlns:w16se="http://schemas.microsoft.com/office/word/2015/wordml/symex" xmlns:wpg="http://schemas.microsoft.com/office/word/2010/wordprocessingGroup" xmlns:wpi="http://schemas.microsoft.com/office/word/2010/wordprocessingInk" xmlns:wne="http://schemas.microsoft.com/office/word/2006/wordml" xmlns:wps="http://schemas.microsoft.com/office/word/2010/wordprocessingShape" mc:Ignorable="w14 w15 w16se w16cid w16 w16cex w16sdtdh w16sdtfl w16du wp14">
   <w:abstractNum w:abstractNumId="0" w15:restartNumberingAfterBreak="0">
     <w:nsid w:val="52222E9E"/>
     <w:multiLevelType w:val="hybridMultilevel"/>

</xml_diff>